<commit_message>
Embed high-resolution RAG and System Architecture diagrams into Word project report
</commit_message>
<xml_diff>
--- a/EcoPilot_Final_Project_Report_Updated.docx
+++ b/EcoPilot_Final_Project_Report_Updated.docx
@@ -3075,6 +3075,62 @@
         <w:t>Retrieval-Augmented Generation (RAG) anchors model outputs in factual knowledge passages retrieved from a FAISS vector index, preventing ungrounded AI hallucinations:</w:t>
       </w:r>
     </w:p>
+    <w:p>
+      <w:pPr>
+        <w:spacing w:before="160" w:after="80"/>
+        <w:jc w:val="center"/>
+      </w:pPr>
+      <w:r>
+        <w:drawing>
+          <wp:inline xmlns:a="http://schemas.openxmlformats.org/drawingml/2006/main" xmlns:pic="http://schemas.openxmlformats.org/drawingml/2006/picture">
+            <wp:extent cx="5486400" cy="5486400"/>
+            <wp:docPr id="1" name="Picture 1"/>
+            <wp:cNvGraphicFramePr>
+              <a:graphicFrameLocks noChangeAspect="1"/>
+            </wp:cNvGraphicFramePr>
+            <a:graphic>
+              <a:graphicData uri="http://schemas.openxmlformats.org/drawingml/2006/picture">
+                <pic:pic>
+                  <pic:nvPicPr>
+                    <pic:cNvPr id="0" name="rag_architecture_diagram.png"/>
+                    <pic:cNvPicPr/>
+                  </pic:nvPicPr>
+                  <pic:blipFill>
+                    <a:blip r:embed="rId11"/>
+                    <a:stretch>
+                      <a:fillRect/>
+                    </a:stretch>
+                  </pic:blipFill>
+                  <pic:spPr>
+                    <a:xfrm>
+                      <a:off x="0" y="0"/>
+                      <a:ext cx="5486400" cy="5486400"/>
+                    </a:xfrm>
+                    <a:prstGeom prst="rect"/>
+                  </pic:spPr>
+                </pic:pic>
+              </a:graphicData>
+            </a:graphic>
+          </wp:inline>
+        </w:drawing>
+      </w:r>
+    </w:p>
+    <w:p>
+      <w:pPr>
+        <w:spacing w:before="40" w:after="240" w:line="276" w:lineRule="auto"/>
+        <w:jc w:val="center"/>
+      </w:pPr>
+      <w:r>
+        <w:rPr>
+          <w:rFonts w:ascii="Times New Roman" w:hAnsi="Times New Roman"/>
+          <w:b w:val="0"/>
+          <w:i/>
+          <w:color w:val="505050"/>
+          <w:sz w:val="19"/>
+        </w:rPr>
+        <w:t>Figure 9.1 — Retrieval-Augmented Generation (RAG) Architecture Workflow Diagram</w:t>
+      </w:r>
+    </w:p>
     <w:tbl>
       <w:tblPr>
         <w:tblW w:type="auto" w:w="0"/>
@@ -3381,6 +3437,62 @@
           <w:sz w:val="22"/>
         </w:rPr>
         <w:t>EcoPilot uses a 3-tier architecture isolating client, API, and cloud services:</w:t>
+      </w:r>
+    </w:p>
+    <w:p>
+      <w:pPr>
+        <w:spacing w:before="160" w:after="80"/>
+        <w:jc w:val="center"/>
+      </w:pPr>
+      <w:r>
+        <w:drawing>
+          <wp:inline xmlns:a="http://schemas.openxmlformats.org/drawingml/2006/main" xmlns:pic="http://schemas.openxmlformats.org/drawingml/2006/picture">
+            <wp:extent cx="5486400" cy="5486400"/>
+            <wp:docPr id="2" name="Picture 2"/>
+            <wp:cNvGraphicFramePr>
+              <a:graphicFrameLocks noChangeAspect="1"/>
+            </wp:cNvGraphicFramePr>
+            <a:graphic>
+              <a:graphicData uri="http://schemas.openxmlformats.org/drawingml/2006/picture">
+                <pic:pic>
+                  <pic:nvPicPr>
+                    <pic:cNvPr id="0" name="system_architecture_diagram.png"/>
+                    <pic:cNvPicPr/>
+                  </pic:nvPicPr>
+                  <pic:blipFill>
+                    <a:blip r:embed="rId12"/>
+                    <a:stretch>
+                      <a:fillRect/>
+                    </a:stretch>
+                  </pic:blipFill>
+                  <pic:spPr>
+                    <a:xfrm>
+                      <a:off x="0" y="0"/>
+                      <a:ext cx="5486400" cy="5486400"/>
+                    </a:xfrm>
+                    <a:prstGeom prst="rect"/>
+                  </pic:spPr>
+                </pic:pic>
+              </a:graphicData>
+            </a:graphic>
+          </wp:inline>
+        </w:drawing>
+      </w:r>
+    </w:p>
+    <w:p>
+      <w:pPr>
+        <w:spacing w:before="40" w:after="240" w:line="276" w:lineRule="auto"/>
+        <w:jc w:val="center"/>
+      </w:pPr>
+      <w:r>
+        <w:rPr>
+          <w:rFonts w:ascii="Times New Roman" w:hAnsi="Times New Roman"/>
+          <w:b w:val="0"/>
+          <w:i/>
+          <w:color w:val="505050"/>
+          <w:sz w:val="19"/>
+        </w:rPr>
+        <w:t>Figure 10.1 — EcoPilot 3-Tier System Architecture Model Diagram</w:t>
       </w:r>
     </w:p>
     <w:tbl>

</xml_diff>